<commit_message>
Render concentration index formula as plain text
</commit_message>
<xml_diff>
--- a/Senior Tranche Lifetime PD - Approach 1 Limitations and Q-Factor Design.docx
+++ b/Senior Tranche Lifetime PD - Approach 1 Limitations and Q-Factor Design.docx
@@ -1508,260 +1508,176 @@
       <w:pPr>
         <w:pStyle w:val="BodyText"/>
       </w:pPr>
-      <m:oMathPara>
-        <m:oMathParaPr>
-          <m:jc m:val="center"/>
-        </m:oMathParaPr>
-        <m:oMath>
-          <m:r>
-            <m:t>C</m:t>
-          </m:r>
-          <m:r>
-            <m:rPr>
-              <m:sty m:val="p"/>
-            </m:rPr>
-            <m:t>=</m:t>
-          </m:r>
-          <m:nary>
-            <m:naryPr>
-              <m:chr m:val="∑"/>
-              <m:limLoc m:val="undOvr"/>
-              <m:subHide m:val="off"/>
-              <m:supHide m:val="on"/>
-            </m:naryPr>
-            <m:sub>
-              <m:r>
-                <m:t>q</m:t>
-              </m:r>
-            </m:sub>
-            <m:sup>
-              <m:r>
-                <m:t>​</m:t>
-              </m:r>
-            </m:sup>
-            <m:e>
-              <m:sSubSup>
-                <m:e>
-                  <m:r>
-                    <m:t>s</m:t>
-                  </m:r>
-                </m:e>
-                <m:sub>
-                  <m:r>
-                    <m:t>q</m:t>
-                  </m:r>
-                </m:sub>
-                <m:sup>
-                  <m:r>
-                    <m:t>2</m:t>
-                  </m:r>
-                </m:sup>
-              </m:sSubSup>
-            </m:e>
-          </m:nary>
-          <m:r>
-            <m:rPr>
-              <m:sty m:val="p"/>
-            </m:rPr>
-            <m:t>,</m:t>
-          </m:r>
-          <m:r>
-            <m:t>  </m:t>
-          </m:r>
-          <m:sSub>
-            <m:e>
-              <m:r>
-                <m:t>s</m:t>
-              </m:r>
-            </m:e>
-            <m:sub>
-              <m:r>
-                <m:t>q</m:t>
-              </m:r>
-            </m:sub>
-          </m:sSub>
-          <m:r>
-            <m:rPr>
-              <m:sty m:val="p"/>
-            </m:rPr>
-            <m:t>=</m:t>
-          </m:r>
-          <m:f>
-            <m:fPr>
-              <m:type m:val="bar"/>
-            </m:fPr>
-            <m:num>
-              <m:nary>
-                <m:naryPr>
-                  <m:chr m:val="∑"/>
-                  <m:limLoc m:val="undOvr"/>
-                  <m:subHide m:val="off"/>
-                  <m:supHide m:val="on"/>
-                </m:naryPr>
-                <m:sub>
-                  <m:r>
-                    <m:t>i</m:t>
-                  </m:r>
-                  <m:r>
-                    <m:rPr>
-                      <m:sty m:val="p"/>
-                    </m:rPr>
-                    <m:t>∈</m:t>
-                  </m:r>
-                  <m:r>
-                    <m:t>q</m:t>
-                  </m:r>
-                </m:sub>
-                <m:sup>
-                  <m:r>
-                    <m:t>​</m:t>
-                  </m:r>
-                </m:sup>
-                <m:e>
-                  <m:sSub>
-                    <m:e>
-                      <m:r>
-                        <m:t>B</m:t>
-                      </m:r>
-                    </m:e>
-                    <m:sub>
-                      <m:r>
-                        <m:t>i</m:t>
-                      </m:r>
-                    </m:sub>
-                  </m:sSub>
-                </m:e>
-              </m:nary>
-              <m:r>
-                <m:rPr>
-                  <m:sty m:val="p"/>
-                </m:rPr>
-                <m:t>⋅</m:t>
-              </m:r>
-              <m:r>
-                <m:t>P</m:t>
-              </m:r>
-              <m:sSubSup>
-                <m:e>
-                  <m:r>
-                    <m:t>D</m:t>
-                  </m:r>
-                </m:e>
-                <m:sub>
-                  <m:r>
-                    <m:t>i</m:t>
-                  </m:r>
-                </m:sub>
-                <m:sup>
-                  <m:r>
-                    <m:t>b</m:t>
-                  </m:r>
-                  <m:r>
-                    <m:t>a</m:t>
-                  </m:r>
-                  <m:r>
-                    <m:t>l</m:t>
-                  </m:r>
-                  <m:r>
-                    <m:t>l</m:t>
-                  </m:r>
-                  <m:r>
-                    <m:t>o</m:t>
-                  </m:r>
-                  <m:r>
-                    <m:t>o</m:t>
-                  </m:r>
-                  <m:r>
-                    <m:t>n</m:t>
-                  </m:r>
-                </m:sup>
-              </m:sSubSup>
-            </m:num>
-            <m:den>
-              <m:nary>
-                <m:naryPr>
-                  <m:chr m:val="∑"/>
-                  <m:limLoc m:val="undOvr"/>
-                  <m:subHide m:val="off"/>
-                  <m:supHide m:val="on"/>
-                </m:naryPr>
-                <m:sub>
-                  <m:r>
-                    <m:t>i</m:t>
-                  </m:r>
-                </m:sub>
-                <m:sup>
-                  <m:r>
-                    <m:t>​</m:t>
-                  </m:r>
-                </m:sup>
-                <m:e>
-                  <m:sSub>
-                    <m:e>
-                      <m:r>
-                        <m:t>B</m:t>
-                      </m:r>
-                    </m:e>
-                    <m:sub>
-                      <m:r>
-                        <m:t>i</m:t>
-                      </m:r>
-                    </m:sub>
-                  </m:sSub>
-                </m:e>
-              </m:nary>
-              <m:r>
-                <m:rPr>
-                  <m:sty m:val="p"/>
-                </m:rPr>
-                <m:t>⋅</m:t>
-              </m:r>
-              <m:r>
-                <m:t>P</m:t>
-              </m:r>
-              <m:sSubSup>
-                <m:e>
-                  <m:r>
-                    <m:t>D</m:t>
-                  </m:r>
-                </m:e>
-                <m:sub>
-                  <m:r>
-                    <m:t>i</m:t>
-                  </m:r>
-                </m:sub>
-                <m:sup>
-                  <m:r>
-                    <m:t>b</m:t>
-                  </m:r>
-                  <m:r>
-                    <m:t>a</m:t>
-                  </m:r>
-                  <m:r>
-                    <m:t>l</m:t>
-                  </m:r>
-                  <m:r>
-                    <m:t>l</m:t>
-                  </m:r>
-                  <m:r>
-                    <m:t>o</m:t>
-                  </m:r>
-                  <m:r>
-                    <m:t>o</m:t>
-                  </m:r>
-                  <m:r>
-                    <m:t>n</m:t>
-                  </m:r>
-                </m:sup>
-              </m:sSubSup>
-            </m:den>
-          </m:f>
-        </m:oMath>
-      </m:oMathPara>
-    </w:p>
-    <w:p>
-      <w:pPr>
-        <w:pStyle w:val="FirstParagraph"/>
+      <w:r>
+        <w:rPr>
+          <w:iCs/>
+          <w:i/>
+        </w:rPr>
+        <w:t xml:space="preserve">C</w:t>
+      </w:r>
+      <w:r>
+        <w:t xml:space="preserve"> </w:t>
+      </w:r>
+      <w:r>
+        <w:t xml:space="preserve">= Σ</w:t>
+      </w:r>
+      <w:r>
+        <w:rPr>
+          <w:vertAlign w:val="subscript"/>
+        </w:rPr>
+        <w:t xml:space="preserve">q</w:t>
+      </w:r>
+      <w:r>
+        <w:t xml:space="preserve"> </w:t>
+      </w:r>
+      <w:r>
+        <w:rPr>
+          <w:iCs/>
+          <w:i/>
+        </w:rPr>
+        <w:t xml:space="preserve">s</w:t>
+      </w:r>
+      <w:r>
+        <w:rPr>
+          <w:vertAlign w:val="subscript"/>
+        </w:rPr>
+        <w:t xml:space="preserve">q</w:t>
+      </w:r>
+      <w:r>
+        <w:t xml:space="preserve">², where</w:t>
+      </w:r>
+      <w:r>
+        <w:t xml:space="preserve"> </w:t>
+      </w:r>
+      <w:r>
+        <w:rPr>
+          <w:iCs/>
+          <w:i/>
+        </w:rPr>
+        <w:t xml:space="preserve">s</w:t>
+      </w:r>
+      <w:r>
+        <w:rPr>
+          <w:vertAlign w:val="subscript"/>
+        </w:rPr>
+        <w:t xml:space="preserve">q</w:t>
+      </w:r>
+      <w:r>
+        <w:t xml:space="preserve"> </w:t>
+      </w:r>
+      <w:r>
+        <w:t xml:space="preserve">= (Σ</w:t>
+      </w:r>
+      <w:r>
+        <w:rPr>
+          <w:vertAlign w:val="subscript"/>
+        </w:rPr>
+        <w:t xml:space="preserve">i∈q</w:t>
+      </w:r>
+      <w:r>
+        <w:t xml:space="preserve"> </w:t>
+      </w:r>
+      <w:r>
+        <w:rPr>
+          <w:iCs/>
+          <w:i/>
+        </w:rPr>
+        <w:t xml:space="preserve">B</w:t>
+      </w:r>
+      <w:r>
+        <w:rPr>
+          <w:vertAlign w:val="subscript"/>
+        </w:rPr>
+        <w:t xml:space="preserve">i</w:t>
+      </w:r>
+      <w:r>
+        <w:t xml:space="preserve"> </w:t>
+      </w:r>
+      <w:r>
+        <w:t xml:space="preserve">×</w:t>
+      </w:r>
+      <w:r>
+        <w:t xml:space="preserve"> </w:t>
+      </w:r>
+      <w:r>
+        <w:rPr>
+          <w:iCs/>
+          <w:i/>
+        </w:rPr>
+        <w:t xml:space="preserve">PD</w:t>
+      </w:r>
+      <w:r>
+        <w:rPr>
+          <w:vertAlign w:val="subscript"/>
+        </w:rPr>
+        <w:t xml:space="preserve">i</w:t>
+      </w:r>
+      <w:r>
+        <w:rPr>
+          <w:vertAlign w:val="superscript"/>
+        </w:rPr>
+        <w:t xml:space="preserve">balloon</w:t>
+      </w:r>
+      <w:r>
+        <w:t xml:space="preserve">) ÷ (Σ</w:t>
+      </w:r>
+      <w:r>
+        <w:rPr>
+          <w:vertAlign w:val="subscript"/>
+        </w:rPr>
+        <w:t xml:space="preserve">i</w:t>
+      </w:r>
+      <w:r>
+        <w:t xml:space="preserve"> </w:t>
+      </w:r>
+      <w:r>
+        <w:rPr>
+          <w:iCs/>
+          <w:i/>
+        </w:rPr>
+        <w:t xml:space="preserve">B</w:t>
+      </w:r>
+      <w:r>
+        <w:rPr>
+          <w:vertAlign w:val="subscript"/>
+        </w:rPr>
+        <w:t xml:space="preserve">i</w:t>
+      </w:r>
+      <w:r>
+        <w:t xml:space="preserve"> </w:t>
+      </w:r>
+      <w:r>
+        <w:t xml:space="preserve">×</w:t>
+      </w:r>
+      <w:r>
+        <w:t xml:space="preserve"> </w:t>
+      </w:r>
+      <w:r>
+        <w:rPr>
+          <w:iCs/>
+          <w:i/>
+        </w:rPr>
+        <w:t xml:space="preserve">PD</w:t>
+      </w:r>
+      <w:r>
+        <w:rPr>
+          <w:vertAlign w:val="subscript"/>
+        </w:rPr>
+        <w:t xml:space="preserve">i</w:t>
+      </w:r>
+      <w:r>
+        <w:rPr>
+          <w:vertAlign w:val="superscript"/>
+        </w:rPr>
+        <w:t xml:space="preserve">balloon</w:t>
+      </w:r>
+      <w:r>
+        <w:t xml:space="preserve">)</w:t>
+      </w:r>
+    </w:p>
+    <w:p>
+      <w:pPr>
+        <w:pStyle w:val="BodyText"/>
       </w:pPr>
       <w:r>
         <w:t xml:space="preserve">where B is loan balance and q indexes maturity quarters. An even ladder over 20 quarters gives C = 0.05; a single-quarter wall gives C = 1.0.</w:t>

</xml_diff>